<commit_message>
💎 Upgrade POUPE Pro: 60+ templates com conteúdo profissional pesado gerados a partir de fontes Markdown
</commit_message>
<xml_diff>
--- a/templates/01_geral/03_declaracao_pessoal.docx
+++ b/templates/01_geral/03_declaracao_pessoal.docx
@@ -30,73 +30,157 @@
           <w:sz w:val="20"/>
           <w:szCs w:val="20"/>
         </w:rPr>
-        <w:t xml:space="preserve">Eu, [NOME], declaro para os devidos fins que [CONTEÚDO DA DECLARAÇÃO].</w:t>
-      </w:r>
-    </w:p>
-    <w:p>
-      <w:pPr>
-        <w:spacing w:after="100" w:before="100"/>
-        <w:ind w:left="400"/>
-      </w:pPr>
-      <w:r>
-        <w:rPr>
-          <w:rFonts w:ascii="Arial" w:cs="Arial" w:eastAsia="Arial" w:hAnsi="Arial"/>
-          <w:b/>
-          <w:bCs/>
-          <w:color w:val="2D6A4F"/>
-          <w:sz w:val="20"/>
-          <w:szCs w:val="20"/>
-        </w:rPr>
-        <w:t xml:space="preserve">Data: </w:t>
-      </w:r>
-      <w:r>
-        <w:rPr>
-          <w:rFonts w:ascii="Arial" w:cs="Arial" w:eastAsia="Arial" w:hAnsi="Arial"/>
+        <w:t xml:space="preserve">Eu, **[NOME COMPLETO DO DECLARANTE]**, portador(a) do RG nº **[NÚMERO]** e inscrito(a) no CPF sob o nº **[NÚMERO]**, residente e domiciliado(a) em **[ENDEREÇO COMPLETO]**.</w:t>
+      </w:r>
+    </w:p>
+    <w:p>
+      <w:pPr>
+        <w:spacing w:after="100" w:before="100"/>
+      </w:pPr>
+      <w:r>
+        <w:rPr>
+          <w:rFonts w:ascii="Arial" w:cs="Arial" w:eastAsia="Arial" w:hAnsi="Arial"/>
+          <w:color w:val="111827"/>
+          <w:sz w:val="20"/>
+          <w:szCs w:val="20"/>
+        </w:rPr>
+        <w:t xml:space="preserve">**DECLARO** para os devidos fins que:</w:t>
+      </w:r>
+    </w:p>
+    <w:p>
+      <w:pPr>
+        <w:spacing w:after="100" w:before="100"/>
+      </w:pPr>
+      <w:r>
+        <w:rPr>
+          <w:rFonts w:ascii="Arial" w:cs="Arial" w:eastAsia="Arial" w:hAnsi="Arial"/>
+          <w:color w:val="111827"/>
+          <w:sz w:val="20"/>
+          <w:szCs w:val="20"/>
+        </w:rPr>
+        <w:t xml:space="preserve">[DESCREVER O CONTEÚDO DA DECLARAÇÃO – EX: RESIDÊNCIA, VÍNCULO, ESTADO CIVIL, ETC.].</w:t>
+      </w:r>
+    </w:p>
+    <w:p>
+      <w:pPr>
+        <w:spacing w:after="100" w:before="100"/>
+      </w:pPr>
+      <w:r>
+        <w:rPr>
+          <w:rFonts w:ascii="Arial" w:cs="Arial" w:eastAsia="Arial" w:hAnsi="Arial"/>
+          <w:color w:val="111827"/>
+          <w:sz w:val="20"/>
+          <w:szCs w:val="20"/>
+        </w:rPr>
+        <w:t xml:space="preserve">Esta declaração é a expressão fiel da verdade e assumo total responsabilidade civil e criminal por todas as informações acima prestadas.</w:t>
+      </w:r>
+    </w:p>
+    <w:p>
+      <w:pPr>
+        <w:spacing w:after="100" w:before="100"/>
+      </w:pPr>
+      <w:r>
+        <w:rPr>
+          <w:rFonts w:ascii="Arial" w:cs="Arial" w:eastAsia="Arial" w:hAnsi="Arial"/>
+          <w:color w:val="111827"/>
+          <w:sz w:val="20"/>
+          <w:szCs w:val="20"/>
+        </w:rPr>
+        <w:t xml:space="preserve">Pelo que firmo a presente.</w:t>
+      </w:r>
+    </w:p>
+    <w:p>
+      <w:pPr>
+        <w:spacing w:after="100" w:before="100"/>
+      </w:pPr>
+      <w:r>
+        <w:rPr>
+          <w:rFonts w:ascii="Arial" w:cs="Arial" w:eastAsia="Arial" w:hAnsi="Arial"/>
+          <w:color w:val="111827"/>
+          <w:sz w:val="20"/>
+          <w:szCs w:val="20"/>
+        </w:rPr>
+        <w:t xml:space="preserve">[CIDADE], [DIA] de [MÊS] de [ANO]</w:t>
+      </w:r>
+    </w:p>
+    <w:p>
+      <w:pPr>
+        <w:spacing w:before="600"/>
+      </w:pPr>
+      <w:r>
+        <w:rPr>
+          <w:sz w:val="20"/>
+          <w:szCs w:val="20"/>
+        </w:rPr>
+        <w:t xml:space="preserve"/>
+      </w:r>
+    </w:p>
+    <w:p>
+      <w:pPr>
+        <w:jc w:val="center"/>
+      </w:pPr>
+      <w:r>
+        <w:rPr>
+          <w:sz w:val="20"/>
+          <w:szCs w:val="20"/>
+        </w:rPr>
+        <w:t xml:space="preserve">________________________________________</w:t>
+      </w:r>
+    </w:p>
+    <w:p>
+      <w:pPr>
+        <w:jc w:val="center"/>
+      </w:pPr>
+      <w:r>
+        <w:rPr>
           <w:i/>
           <w:iCs/>
-          <w:color w:val="6B7280"/>
-          <w:sz w:val="20"/>
-          <w:szCs w:val="20"/>
-        </w:rPr>
-        <w:t xml:space="preserve">[CIDADE], [DIA] de [MÊS] de [ANO]</w:t>
-      </w:r>
-    </w:p>
-    <w:p>
-      <w:pPr>
-        <w:spacing w:before="600"/>
-      </w:pPr>
-      <w:r>
-        <w:rPr>
-          <w:sz w:val="20"/>
-          <w:szCs w:val="20"/>
-        </w:rPr>
-        <w:t xml:space="preserve"/>
-      </w:r>
-    </w:p>
-    <w:p>
-      <w:pPr>
-        <w:jc w:val="center"/>
-      </w:pPr>
-      <w:r>
-        <w:rPr>
-          <w:sz w:val="20"/>
-          <w:szCs w:val="20"/>
-        </w:rPr>
-        <w:t xml:space="preserve">________________________________________</w:t>
-      </w:r>
-    </w:p>
-    <w:p>
-      <w:pPr>
-        <w:jc w:val="center"/>
-      </w:pPr>
-      <w:r>
-        <w:rPr>
-          <w:i/>
-          <w:iCs/>
-          <w:sz w:val="20"/>
-          <w:szCs w:val="20"/>
-        </w:rPr>
-        <w:t xml:space="preserve">Responsável</w:t>
+          <w:sz w:val="20"/>
+          <w:szCs w:val="20"/>
+        </w:rPr>
+        <w:t xml:space="preserve">[Assinatura]</w:t>
+      </w:r>
+    </w:p>
+    <w:p>
+      <w:pPr>
+        <w:spacing w:after="100" w:before="100"/>
+      </w:pPr>
+      <w:r>
+        <w:rPr>
+          <w:rFonts w:ascii="Arial" w:cs="Arial" w:eastAsia="Arial" w:hAnsi="Arial"/>
+          <w:color w:val="111827"/>
+          <w:sz w:val="20"/>
+          <w:szCs w:val="20"/>
+        </w:rPr>
+        <w:t xml:space="preserve">**ASSINATURA DO DECLARANTE**</w:t>
+      </w:r>
+    </w:p>
+    <w:p>
+      <w:pPr>
+        <w:spacing w:after="100" w:before="100"/>
+      </w:pPr>
+      <w:r>
+        <w:rPr>
+          <w:rFonts w:ascii="Arial" w:cs="Arial" w:eastAsia="Arial" w:hAnsi="Arial"/>
+          <w:color w:val="111827"/>
+          <w:sz w:val="20"/>
+          <w:szCs w:val="20"/>
+        </w:rPr>
+        <w:t xml:space="preserve">[NOME COMPLETO]</w:t>
+      </w:r>
+    </w:p>
+    <w:p>
+      <w:pPr>
+        <w:spacing w:after="100" w:before="100"/>
+      </w:pPr>
+      <w:r>
+        <w:rPr>
+          <w:rFonts w:ascii="Arial" w:cs="Arial" w:eastAsia="Arial" w:hAnsi="Arial"/>
+          <w:color w:val="111827"/>
+          <w:sz w:val="20"/>
+          <w:szCs w:val="20"/>
+        </w:rPr>
+        <w:t xml:space="preserve">[CPF/CNPJ]</w:t>
       </w:r>
     </w:p>
     <w:sectPr>

</xml_diff>